<commit_message>
Continue the Retro THM CTF
</commit_message>
<xml_diff>
--- a/THM_challenges/Hard/Retro/Retro_Solution_Documentation.docx
+++ b/THM_challenges/Hard/Retro/Retro_Solution_Documentation.docx
@@ -47,6 +47,25 @@
       </w:r>
     </w:p>
     <w:p>
+      <w:pPr>
+        <w:pStyle w:val="a9"/>
+        <w:numPr>
+          <w:ilvl w:val="0"/>
+          <w:numId w:val="2"/>
+        </w:numPr>
+        <w:rPr>
+          <w:b/>
+          <w:bCs/>
+          <w:sz w:val="28"/>
+          <w:szCs w:val="28"/>
+          <w:u w:val="single"/>
+        </w:rPr>
+      </w:pPr>
+      <w:r>
+        <w:t>Pay attention that the target’s machine IP was changed from time to time.</w:t>
+      </w:r>
+    </w:p>
+    <w:p>
       <w:r>
         <w:t xml:space="preserve">I </w:t>
       </w:r>
@@ -59,6 +78,9 @@
     </w:p>
     <w:p>
       <w:r>
+        <w:rPr>
+          <w:noProof/>
+        </w:rPr>
         <w:drawing>
           <wp:inline distT="0" distB="0" distL="0" distR="0" wp14:anchorId="058C24D5" wp14:editId="6C6DBE9E">
             <wp:extent cx="5208721" cy="3638865"/>
@@ -75,7 +97,7 @@
                     <pic:cNvPicPr/>
                   </pic:nvPicPr>
                   <pic:blipFill>
-                    <a:blip r:embed="rId4"/>
+                    <a:blip r:embed="rId5"/>
                     <a:stretch>
                       <a:fillRect/>
                     </a:stretch>
@@ -136,6 +158,7 @@
         <w:t>:</w:t>
       </w:r>
     </w:p>
+    <w:p/>
     <w:p>
       <w:r>
         <w:t xml:space="preserve">I </w:t>
@@ -161,6 +184,10 @@
     </w:p>
     <w:p>
       <w:r>
+        <w:rPr>
+          <w:noProof/>
+        </w:rPr>
+        <w:lastRenderedPageBreak/>
         <w:drawing>
           <wp:inline distT="0" distB="0" distL="0" distR="0" wp14:anchorId="74678F20" wp14:editId="10659418">
             <wp:extent cx="7556500" cy="3796030"/>
@@ -177,7 +204,7 @@
                     <pic:cNvPicPr/>
                   </pic:nvPicPr>
                   <pic:blipFill>
-                    <a:blip r:embed="rId5"/>
+                    <a:blip r:embed="rId6"/>
                     <a:stretch>
                       <a:fillRect/>
                     </a:stretch>
@@ -200,37 +227,548 @@
     </w:p>
     <w:p>
       <w:r>
+        <w:t xml:space="preserve">I </w:t>
+      </w:r>
+      <w:r>
+        <w:t xml:space="preserve">read a bit the </w:t>
+      </w:r>
+      <w:r>
+        <w:t>posts</w:t>
+      </w:r>
+      <w:r>
+        <w:t xml:space="preserve"> </w:t>
+      </w:r>
+      <w:r>
+        <w:t xml:space="preserve">that </w:t>
+      </w:r>
+      <w:r>
+        <w:t>were</w:t>
+      </w:r>
+      <w:r>
+        <w:t xml:space="preserve"> shown on this page in order to find some clues.</w:t>
+      </w:r>
+      <w:r>
+        <w:t xml:space="preserve"> I </w:t>
+      </w:r>
+      <w:r>
+        <w:t xml:space="preserve">found that all the posts were </w:t>
+      </w:r>
+      <w:r>
+        <w:t>written by the same user named “Wade”</w:t>
+      </w:r>
+      <w:r>
+        <w:t>.</w:t>
+      </w:r>
+    </w:p>
+    <w:p>
+      <w:r>
+        <w:t xml:space="preserve">Additionally, </w:t>
+      </w:r>
+      <w:r>
+        <w:t>I paid attention to this post:</w:t>
+      </w:r>
+    </w:p>
+    <w:p>
+      <w:r>
+        <w:drawing>
+          <wp:inline distT="0" distB="0" distL="0" distR="0" wp14:anchorId="0004448B" wp14:editId="3EC6433E">
+            <wp:extent cx="5970787" cy="1638442"/>
+            <wp:effectExtent l="0" t="0" r="0" b="0"/>
+            <wp:docPr id="1185174796" name="תמונה 1"/>
+            <wp:cNvGraphicFramePr>
+              <a:graphicFrameLocks xmlns:a="http://schemas.openxmlformats.org/drawingml/2006/main" noChangeAspect="1"/>
+            </wp:cNvGraphicFramePr>
+            <a:graphic xmlns:a="http://schemas.openxmlformats.org/drawingml/2006/main">
+              <a:graphicData uri="http://schemas.openxmlformats.org/drawingml/2006/picture">
+                <pic:pic xmlns:pic="http://schemas.openxmlformats.org/drawingml/2006/picture">
+                  <pic:nvPicPr>
+                    <pic:cNvPr id="1185174796" name=""/>
+                    <pic:cNvPicPr/>
+                  </pic:nvPicPr>
+                  <pic:blipFill>
+                    <a:blip r:embed="rId7"/>
+                    <a:stretch>
+                      <a:fillRect/>
+                    </a:stretch>
+                  </pic:blipFill>
+                  <pic:spPr>
+                    <a:xfrm>
+                      <a:off x="0" y="0"/>
+                      <a:ext cx="5970787" cy="1638442"/>
+                    </a:xfrm>
+                    <a:prstGeom prst="rect">
+                      <a:avLst/>
+                    </a:prstGeom>
+                  </pic:spPr>
+                </pic:pic>
+              </a:graphicData>
+            </a:graphic>
+          </wp:inline>
+        </w:drawing>
+      </w:r>
+    </w:p>
+    <w:p>
+      <w:pPr>
+        <w:rPr>
+          <w:rtl/>
+        </w:rPr>
+      </w:pPr>
+      <w:r>
+        <w:t>According to the following paragraph, the write</w:t>
+      </w:r>
+      <w:r>
+        <w:t>r</w:t>
+      </w:r>
+      <w:r>
+        <w:t xml:space="preserve"> </w:t>
+      </w:r>
+      <w:r>
+        <w:t>revealed</w:t>
+      </w:r>
+      <w:r>
+        <w:t xml:space="preserve"> </w:t>
+      </w:r>
+      <w:r>
+        <w:t>his</w:t>
+      </w:r>
+      <w:r>
+        <w:t xml:space="preserve"> username is </w:t>
+      </w:r>
+      <w:r>
+        <w:t>“</w:t>
+      </w:r>
+      <w:r>
+        <w:t>Wade</w:t>
+      </w:r>
+      <w:r>
+        <w:t>”</w:t>
+      </w:r>
+      <w:r>
+        <w:t xml:space="preserve"> </w:t>
+      </w:r>
+      <w:r>
+        <w:t>is also</w:t>
+      </w:r>
+      <w:r>
+        <w:t xml:space="preserve"> his </w:t>
+      </w:r>
+      <w:r>
+        <w:t>avatar’s name</w:t>
+      </w:r>
+      <w:r>
+        <w:t xml:space="preserve"> and</w:t>
+      </w:r>
+      <w:r>
+        <w:t xml:space="preserve"> that there is a login page to this website.</w:t>
+      </w:r>
+      <w:r>
+        <w:t xml:space="preserve"> </w:t>
+      </w:r>
+    </w:p>
+    <w:p>
+      <w:r>
+        <w:t xml:space="preserve">Moreover, I clicked </w:t>
+      </w:r>
+      <w:r>
+        <w:t xml:space="preserve">on the </w:t>
+      </w:r>
+      <w:r>
+        <w:t>author’s</w:t>
+      </w:r>
+      <w:r>
+        <w:t xml:space="preserve"> name and saw his profile:</w:t>
+      </w:r>
+    </w:p>
+    <w:p>
+      <w:r>
         <w:lastRenderedPageBreak/>
-        <w:t xml:space="preserve">I </w:t>
-      </w:r>
-      <w:r>
-        <w:t xml:space="preserve">read a bit the </w:t>
-      </w:r>
-      <w:r>
-        <w:t>posts</w:t>
+        <w:drawing>
+          <wp:inline distT="0" distB="0" distL="0" distR="0" wp14:anchorId="5722A853" wp14:editId="088D9E2F">
+            <wp:extent cx="7556500" cy="4542155"/>
+            <wp:effectExtent l="0" t="0" r="6350" b="0"/>
+            <wp:docPr id="223335902" name="תמונה 1"/>
+            <wp:cNvGraphicFramePr>
+              <a:graphicFrameLocks xmlns:a="http://schemas.openxmlformats.org/drawingml/2006/main" noChangeAspect="1"/>
+            </wp:cNvGraphicFramePr>
+            <a:graphic xmlns:a="http://schemas.openxmlformats.org/drawingml/2006/main">
+              <a:graphicData uri="http://schemas.openxmlformats.org/drawingml/2006/picture">
+                <pic:pic xmlns:pic="http://schemas.openxmlformats.org/drawingml/2006/picture">
+                  <pic:nvPicPr>
+                    <pic:cNvPr id="223335902" name=""/>
+                    <pic:cNvPicPr/>
+                  </pic:nvPicPr>
+                  <pic:blipFill>
+                    <a:blip r:embed="rId8"/>
+                    <a:stretch>
+                      <a:fillRect/>
+                    </a:stretch>
+                  </pic:blipFill>
+                  <pic:spPr>
+                    <a:xfrm>
+                      <a:off x="0" y="0"/>
+                      <a:ext cx="7556500" cy="4542155"/>
+                    </a:xfrm>
+                    <a:prstGeom prst="rect">
+                      <a:avLst/>
+                    </a:prstGeom>
+                  </pic:spPr>
+                </pic:pic>
+              </a:graphicData>
+            </a:graphic>
+          </wp:inline>
+        </w:drawing>
+      </w:r>
+    </w:p>
+    <w:p>
+      <w:r>
+        <w:t xml:space="preserve">Here I clicked </w:t>
+      </w:r>
+      <w:r>
+        <w:t>on “Ready Player One” and I saw on the comments the comment of Wade:</w:t>
+      </w:r>
+    </w:p>
+    <w:p>
+      <w:r>
+        <w:drawing>
+          <wp:inline distT="0" distB="0" distL="0" distR="0" wp14:anchorId="0B5D8321" wp14:editId="537B0D1A">
+            <wp:extent cx="4103726" cy="1531753"/>
+            <wp:effectExtent l="0" t="0" r="0" b="0"/>
+            <wp:docPr id="885096447" name="תמונה 1" descr="תמונה שמכילה טקסט, צילום מסך, גופן&#10;&#10;תוכן בינה מלאכותית גנרטיבית עשוי להיות שגוי."/>
+            <wp:cNvGraphicFramePr>
+              <a:graphicFrameLocks xmlns:a="http://schemas.openxmlformats.org/drawingml/2006/main" noChangeAspect="1"/>
+            </wp:cNvGraphicFramePr>
+            <a:graphic xmlns:a="http://schemas.openxmlformats.org/drawingml/2006/main">
+              <a:graphicData uri="http://schemas.openxmlformats.org/drawingml/2006/picture">
+                <pic:pic xmlns:pic="http://schemas.openxmlformats.org/drawingml/2006/picture">
+                  <pic:nvPicPr>
+                    <pic:cNvPr id="885096447" name="תמונה 1" descr="תמונה שמכילה טקסט, צילום מסך, גופן&#10;&#10;תוכן בינה מלאכותית גנרטיבית עשוי להיות שגוי."/>
+                    <pic:cNvPicPr/>
+                  </pic:nvPicPr>
+                  <pic:blipFill>
+                    <a:blip r:embed="rId9"/>
+                    <a:stretch>
+                      <a:fillRect/>
+                    </a:stretch>
+                  </pic:blipFill>
+                  <pic:spPr>
+                    <a:xfrm>
+                      <a:off x="0" y="0"/>
+                      <a:ext cx="4103726" cy="1531753"/>
+                    </a:xfrm>
+                    <a:prstGeom prst="rect">
+                      <a:avLst/>
+                    </a:prstGeom>
+                  </pic:spPr>
+                </pic:pic>
+              </a:graphicData>
+            </a:graphic>
+          </wp:inline>
+        </w:drawing>
+      </w:r>
+    </w:p>
+    <w:p>
+      <w:r>
+        <w:t>And</w:t>
+      </w:r>
+      <w:r>
+        <w:t xml:space="preserve"> I </w:t>
+      </w:r>
+      <w:r>
+        <w:t>have got</w:t>
       </w:r>
       <w:r>
         <w:t xml:space="preserve"> </w:t>
       </w:r>
       <w:r>
-        <w:t xml:space="preserve">that </w:t>
-      </w:r>
-      <w:r>
-        <w:t>were</w:t>
-      </w:r>
-      <w:r>
-        <w:t xml:space="preserve"> shown on this page in order to find some clues.</w:t>
-      </w:r>
-      <w:r>
-        <w:t xml:space="preserve"> I </w:t>
-      </w:r>
-      <w:r>
-        <w:t xml:space="preserve">found that all the posts were </w:t>
-      </w:r>
-      <w:r>
-        <w:t>written by the same user named “Wade”</w:t>
-      </w:r>
-    </w:p>
+        <w:t xml:space="preserve">here </w:t>
+      </w:r>
+      <w:r>
+        <w:t>another clue</w:t>
+      </w:r>
+      <w:r>
+        <w:t xml:space="preserve">, probably </w:t>
+      </w:r>
+      <w:r>
+        <w:t>to be</w:t>
+      </w:r>
+      <w:r>
+        <w:t xml:space="preserve"> useful for the next step</w:t>
+      </w:r>
+      <w:r>
+        <w:t>s</w:t>
+      </w:r>
+      <w:r>
+        <w:t>.</w:t>
+      </w:r>
+    </w:p>
+    <w:p>
+      <w:r>
+        <w:t xml:space="preserve">Then, I clicked on the </w:t>
+      </w:r>
+      <w:r>
+        <w:t xml:space="preserve">“Log in” </w:t>
+      </w:r>
+      <w:r>
+        <w:t>l</w:t>
+      </w:r>
+      <w:r>
+        <w:t>ink</w:t>
+      </w:r>
+      <w:r>
+        <w:t xml:space="preserve"> that </w:t>
+      </w:r>
+      <w:r>
+        <w:t xml:space="preserve">appeared on the </w:t>
+      </w:r>
+      <w:r>
+        <w:t>bottom of the page</w:t>
+      </w:r>
+      <w:r>
+        <w:t xml:space="preserve">, which </w:t>
+      </w:r>
+      <w:r>
+        <w:t>led me to this WordPress login page:</w:t>
+      </w:r>
+    </w:p>
+    <w:p>
+      <w:r>
+        <w:lastRenderedPageBreak/>
+        <w:drawing>
+          <wp:inline distT="0" distB="0" distL="0" distR="0" wp14:anchorId="37F107AB" wp14:editId="33F84CE4">
+            <wp:extent cx="7556500" cy="3602990"/>
+            <wp:effectExtent l="0" t="0" r="6350" b="0"/>
+            <wp:docPr id="1488272039" name="תמונה 1"/>
+            <wp:cNvGraphicFramePr>
+              <a:graphicFrameLocks xmlns:a="http://schemas.openxmlformats.org/drawingml/2006/main" noChangeAspect="1"/>
+            </wp:cNvGraphicFramePr>
+            <a:graphic xmlns:a="http://schemas.openxmlformats.org/drawingml/2006/main">
+              <a:graphicData uri="http://schemas.openxmlformats.org/drawingml/2006/picture">
+                <pic:pic xmlns:pic="http://schemas.openxmlformats.org/drawingml/2006/picture">
+                  <pic:nvPicPr>
+                    <pic:cNvPr id="1488272039" name=""/>
+                    <pic:cNvPicPr/>
+                  </pic:nvPicPr>
+                  <pic:blipFill>
+                    <a:blip r:embed="rId10"/>
+                    <a:stretch>
+                      <a:fillRect/>
+                    </a:stretch>
+                  </pic:blipFill>
+                  <pic:spPr>
+                    <a:xfrm>
+                      <a:off x="0" y="0"/>
+                      <a:ext cx="7556500" cy="3602990"/>
+                    </a:xfrm>
+                    <a:prstGeom prst="rect">
+                      <a:avLst/>
+                    </a:prstGeom>
+                  </pic:spPr>
+                </pic:pic>
+              </a:graphicData>
+            </a:graphic>
+          </wp:inline>
+        </w:drawing>
+      </w:r>
+    </w:p>
+    <w:p>
+      <w:r>
+        <w:t xml:space="preserve">I thought a little, but then I reminded to myself the </w:t>
+      </w:r>
+      <w:r>
+        <w:t xml:space="preserve">names </w:t>
+      </w:r>
+      <w:r>
+        <w:t xml:space="preserve">“Wade” and “parzival” </w:t>
+      </w:r>
+      <w:r>
+        <w:t>that I discovered earlier</w:t>
+      </w:r>
+      <w:r>
+        <w:t>, so I used them as the username and password (username: Wade, password: parzival)</w:t>
+      </w:r>
+      <w:r>
+        <w:t xml:space="preserve"> and it actually worked!</w:t>
+      </w:r>
+    </w:p>
+    <w:p>
+      <w:r>
+        <w:t>Thereafter, I was entered the</w:t>
+      </w:r>
+      <w:r>
+        <w:t xml:space="preserve"> admin’s</w:t>
+      </w:r>
+      <w:r>
+        <w:t xml:space="preserve"> dashboard page:</w:t>
+      </w:r>
+    </w:p>
+    <w:p>
+      <w:r>
+        <w:drawing>
+          <wp:inline distT="0" distB="0" distL="0" distR="0" wp14:anchorId="073EF632" wp14:editId="0F42FA06">
+            <wp:extent cx="7556500" cy="3168015"/>
+            <wp:effectExtent l="0" t="0" r="6350" b="0"/>
+            <wp:docPr id="1412666" name="תמונה 1"/>
+            <wp:cNvGraphicFramePr>
+              <a:graphicFrameLocks xmlns:a="http://schemas.openxmlformats.org/drawingml/2006/main" noChangeAspect="1"/>
+            </wp:cNvGraphicFramePr>
+            <a:graphic xmlns:a="http://schemas.openxmlformats.org/drawingml/2006/main">
+              <a:graphicData uri="http://schemas.openxmlformats.org/drawingml/2006/picture">
+                <pic:pic xmlns:pic="http://schemas.openxmlformats.org/drawingml/2006/picture">
+                  <pic:nvPicPr>
+                    <pic:cNvPr id="1412666" name=""/>
+                    <pic:cNvPicPr/>
+                  </pic:nvPicPr>
+                  <pic:blipFill>
+                    <a:blip r:embed="rId11"/>
+                    <a:stretch>
+                      <a:fillRect/>
+                    </a:stretch>
+                  </pic:blipFill>
+                  <pic:spPr>
+                    <a:xfrm>
+                      <a:off x="0" y="0"/>
+                      <a:ext cx="7556500" cy="3168015"/>
+                    </a:xfrm>
+                    <a:prstGeom prst="rect">
+                      <a:avLst/>
+                    </a:prstGeom>
+                  </pic:spPr>
+                </pic:pic>
+              </a:graphicData>
+            </a:graphic>
+          </wp:inline>
+        </w:drawing>
+      </w:r>
+    </w:p>
+    <w:p>
+      <w:r>
+        <w:t xml:space="preserve">Here, </w:t>
+      </w:r>
+      <w:r>
+        <w:t>I immediately</w:t>
+      </w:r>
+      <w:r>
+        <w:t xml:space="preserve"> understood that Wade is the admin</w:t>
+      </w:r>
+      <w:r>
+        <w:t xml:space="preserve"> of this website.</w:t>
+      </w:r>
+      <w:r>
+        <w:t xml:space="preserve"> </w:t>
+      </w:r>
+    </w:p>
+    <w:p>
+      <w:r>
+        <w:lastRenderedPageBreak/>
+        <w:t>Second, I</w:t>
+      </w:r>
+      <w:r>
+        <w:t xml:space="preserve"> found on the “Comments” section the email of </w:t>
+      </w:r>
+      <w:r>
+        <w:t xml:space="preserve">Wade: </w:t>
+      </w:r>
+      <w:r>
+        <w:drawing>
+          <wp:inline distT="0" distB="0" distL="0" distR="0" wp14:anchorId="6042327B" wp14:editId="768FE5B3">
+            <wp:extent cx="7556500" cy="2876550"/>
+            <wp:effectExtent l="0" t="0" r="6350" b="0"/>
+            <wp:docPr id="163927768" name="תמונה 1"/>
+            <wp:cNvGraphicFramePr>
+              <a:graphicFrameLocks xmlns:a="http://schemas.openxmlformats.org/drawingml/2006/main" noChangeAspect="1"/>
+            </wp:cNvGraphicFramePr>
+            <a:graphic xmlns:a="http://schemas.openxmlformats.org/drawingml/2006/main">
+              <a:graphicData uri="http://schemas.openxmlformats.org/drawingml/2006/picture">
+                <pic:pic xmlns:pic="http://schemas.openxmlformats.org/drawingml/2006/picture">
+                  <pic:nvPicPr>
+                    <pic:cNvPr id="163927768" name=""/>
+                    <pic:cNvPicPr/>
+                  </pic:nvPicPr>
+                  <pic:blipFill>
+                    <a:blip r:embed="rId12"/>
+                    <a:stretch>
+                      <a:fillRect/>
+                    </a:stretch>
+                  </pic:blipFill>
+                  <pic:spPr>
+                    <a:xfrm>
+                      <a:off x="0" y="0"/>
+                      <a:ext cx="7556500" cy="2876550"/>
+                    </a:xfrm>
+                    <a:prstGeom prst="rect">
+                      <a:avLst/>
+                    </a:prstGeom>
+                  </pic:spPr>
+                </pic:pic>
+              </a:graphicData>
+            </a:graphic>
+          </wp:inline>
+        </w:drawing>
+      </w:r>
+    </w:p>
+    <w:p>
+      <w:r>
+        <w:t xml:space="preserve">And third, I </w:t>
+      </w:r>
+      <w:r>
+        <w:t>noticed that this WordPress version is 5.2</w:t>
+      </w:r>
+      <w:r>
+        <w:t>.1 and that it has these plugins</w:t>
+      </w:r>
+      <w:r>
+        <w:t xml:space="preserve"> (so maybe one of them is </w:t>
+      </w:r>
+      <w:r>
+        <w:t>vulnerable</w:t>
+      </w:r>
+      <w:r>
+        <w:t>)</w:t>
+      </w:r>
+      <w:r>
+        <w:t>:</w:t>
+      </w:r>
+    </w:p>
+    <w:p>
+      <w:r>
+        <w:drawing>
+          <wp:inline distT="0" distB="0" distL="0" distR="0" wp14:anchorId="56E4AF9D" wp14:editId="4109DDD3">
+            <wp:extent cx="7556500" cy="1306195"/>
+            <wp:effectExtent l="0" t="0" r="6350" b="8255"/>
+            <wp:docPr id="1180399346" name="תמונה 1"/>
+            <wp:cNvGraphicFramePr>
+              <a:graphicFrameLocks xmlns:a="http://schemas.openxmlformats.org/drawingml/2006/main" noChangeAspect="1"/>
+            </wp:cNvGraphicFramePr>
+            <a:graphic xmlns:a="http://schemas.openxmlformats.org/drawingml/2006/main">
+              <a:graphicData uri="http://schemas.openxmlformats.org/drawingml/2006/picture">
+                <pic:pic xmlns:pic="http://schemas.openxmlformats.org/drawingml/2006/picture">
+                  <pic:nvPicPr>
+                    <pic:cNvPr id="1180399346" name=""/>
+                    <pic:cNvPicPr/>
+                  </pic:nvPicPr>
+                  <pic:blipFill>
+                    <a:blip r:embed="rId13"/>
+                    <a:stretch>
+                      <a:fillRect/>
+                    </a:stretch>
+                  </pic:blipFill>
+                  <pic:spPr>
+                    <a:xfrm>
+                      <a:off x="0" y="0"/>
+                      <a:ext cx="7556500" cy="1306195"/>
+                    </a:xfrm>
+                    <a:prstGeom prst="rect">
+                      <a:avLst/>
+                    </a:prstGeom>
+                  </pic:spPr>
+                </pic:pic>
+              </a:graphicData>
+            </a:graphic>
+          </wp:inline>
+        </w:drawing>
+      </w:r>
+    </w:p>
+    <w:p/>
     <w:sectPr>
       <w:pgSz w:w="12240" w:h="15840"/>
       <w:pgMar w:top="170" w:right="170" w:bottom="170" w:left="170" w:header="720" w:footer="720" w:gutter="0"/>
@@ -240,6 +778,241 @@
     </w:sectPr>
   </w:body>
 </w:document>
+</file>
+
+<file path=word/numbering.xml><?xml version="1.0" encoding="utf-8"?>
+<w:numbering xmlns:wpc="http://schemas.microsoft.com/office/word/2010/wordprocessingCanvas" xmlns:cx="http://schemas.microsoft.com/office/drawing/2014/chartex" xmlns:cx1="http://schemas.microsoft.com/office/drawing/2015/9/8/chartex" xmlns:cx2="http://schemas.microsoft.com/office/drawing/2015/10/21/chartex" xmlns:cx3="http://schemas.microsoft.com/office/drawing/2016/5/9/chartex" xmlns:cx4="http://schemas.microsoft.com/office/drawing/2016/5/10/chartex" xmlns:cx5="http://schemas.microsoft.com/office/drawing/2016/5/11/chartex" xmlns:cx6="http://schemas.microsoft.com/office/drawing/2016/5/12/chartex" xmlns:cx7="http://schemas.microsoft.com/office/drawing/2016/5/13/chartex" xmlns:cx8="http://schemas.microsoft.com/office/drawing/2016/5/14/chartex" xmlns:mc="http://schemas.openxmlformats.org/markup-compatibility/2006" xmlns:aink="http://schemas.microsoft.com/office/drawing/2016/ink" xmlns:am3d="http://schemas.microsoft.com/office/drawing/2017/model3d" xmlns:o="urn:schemas-microsoft-com:office:office" xmlns:oel="http://schemas.microsoft.com/office/2019/extlst" xmlns:r="http://schemas.openxmlformats.org/officeDocument/2006/relationships" xmlns:m="http://schemas.openxmlformats.org/officeDocument/2006/math" xmlns:v="urn:schemas-microsoft-com:vml" xmlns:wp14="http://schemas.microsoft.com/office/word/2010/wordprocessingDrawing" xmlns:wp="http://schemas.openxmlformats.org/drawingml/2006/wordprocessingDrawing" xmlns:w10="urn:schemas-microsoft-com:office:word" xmlns:w="http://schemas.openxmlformats.org/wordprocessingml/2006/main" xmlns:w14="http://schemas.microsoft.com/office/word/2010/wordml" xmlns:w15="http://schemas.microsoft.com/office/word/2012/wordml" xmlns:w16cex="http://schemas.microsoft.com/office/word/2018/wordml/cex" xmlns:w16cid="http://schemas.microsoft.com/office/word/2016/wordml/cid" xmlns:w16="http://schemas.microsoft.com/office/word/2018/wordml" xmlns:w16du="http://schemas.microsoft.com/office/word/2023/wordml/word16du" xmlns:w16sdtdh="http://schemas.microsoft.com/office/word/2020/wordml/sdtdatahash" xmlns:w16sdtfl="http://schemas.microsoft.com/office/word/2024/wordml/sdtformatlock" xmlns:w16se="http://schemas.microsoft.com/office/word/2015/wordml/symex" xmlns:wpg="http://schemas.microsoft.com/office/word/2010/wordprocessingGroup" xmlns:wpi="http://schemas.microsoft.com/office/word/2010/wordprocessingInk" xmlns:wne="http://schemas.microsoft.com/office/word/2006/wordml" xmlns:wps="http://schemas.microsoft.com/office/word/2010/wordprocessingShape" mc:Ignorable="w14 w15 w16se w16cid w16 w16cex w16sdtdh w16sdtfl w16du wp14">
+  <w:abstractNum w:abstractNumId="0" w15:restartNumberingAfterBreak="0">
+    <w:nsid w:val="1BB240F2"/>
+    <w:multiLevelType w:val="hybridMultilevel"/>
+    <w:tmpl w:val="ABBA8C90"/>
+    <w:lvl w:ilvl="0" w:tplc="C7DCD436">
+      <w:numFmt w:val="bullet"/>
+      <w:lvlText w:val=""/>
+      <w:lvlJc w:val="left"/>
+      <w:pPr>
+        <w:ind w:left="720" w:hanging="360"/>
+      </w:pPr>
+      <w:rPr>
+        <w:rFonts w:ascii="Symbol" w:eastAsiaTheme="minorHAnsi" w:hAnsi="Symbol" w:cstheme="minorBidi" w:hint="default"/>
+      </w:rPr>
+    </w:lvl>
+    <w:lvl w:ilvl="1" w:tplc="04090003" w:tentative="1">
+      <w:start w:val="1"/>
+      <w:numFmt w:val="bullet"/>
+      <w:lvlText w:val="o"/>
+      <w:lvlJc w:val="left"/>
+      <w:pPr>
+        <w:ind w:left="1440" w:hanging="360"/>
+      </w:pPr>
+      <w:rPr>
+        <w:rFonts w:ascii="Courier New" w:hAnsi="Courier New" w:cs="Courier New" w:hint="default"/>
+      </w:rPr>
+    </w:lvl>
+    <w:lvl w:ilvl="2" w:tplc="04090005" w:tentative="1">
+      <w:start w:val="1"/>
+      <w:numFmt w:val="bullet"/>
+      <w:lvlText w:val=""/>
+      <w:lvlJc w:val="left"/>
+      <w:pPr>
+        <w:ind w:left="2160" w:hanging="360"/>
+      </w:pPr>
+      <w:rPr>
+        <w:rFonts w:ascii="Wingdings" w:hAnsi="Wingdings" w:hint="default"/>
+      </w:rPr>
+    </w:lvl>
+    <w:lvl w:ilvl="3" w:tplc="04090001" w:tentative="1">
+      <w:start w:val="1"/>
+      <w:numFmt w:val="bullet"/>
+      <w:lvlText w:val=""/>
+      <w:lvlJc w:val="left"/>
+      <w:pPr>
+        <w:ind w:left="2880" w:hanging="360"/>
+      </w:pPr>
+      <w:rPr>
+        <w:rFonts w:ascii="Symbol" w:hAnsi="Symbol" w:hint="default"/>
+      </w:rPr>
+    </w:lvl>
+    <w:lvl w:ilvl="4" w:tplc="04090003" w:tentative="1">
+      <w:start w:val="1"/>
+      <w:numFmt w:val="bullet"/>
+      <w:lvlText w:val="o"/>
+      <w:lvlJc w:val="left"/>
+      <w:pPr>
+        <w:ind w:left="3600" w:hanging="360"/>
+      </w:pPr>
+      <w:rPr>
+        <w:rFonts w:ascii="Courier New" w:hAnsi="Courier New" w:cs="Courier New" w:hint="default"/>
+      </w:rPr>
+    </w:lvl>
+    <w:lvl w:ilvl="5" w:tplc="04090005" w:tentative="1">
+      <w:start w:val="1"/>
+      <w:numFmt w:val="bullet"/>
+      <w:lvlText w:val=""/>
+      <w:lvlJc w:val="left"/>
+      <w:pPr>
+        <w:ind w:left="4320" w:hanging="360"/>
+      </w:pPr>
+      <w:rPr>
+        <w:rFonts w:ascii="Wingdings" w:hAnsi="Wingdings" w:hint="default"/>
+      </w:rPr>
+    </w:lvl>
+    <w:lvl w:ilvl="6" w:tplc="04090001" w:tentative="1">
+      <w:start w:val="1"/>
+      <w:numFmt w:val="bullet"/>
+      <w:lvlText w:val=""/>
+      <w:lvlJc w:val="left"/>
+      <w:pPr>
+        <w:ind w:left="5040" w:hanging="360"/>
+      </w:pPr>
+      <w:rPr>
+        <w:rFonts w:ascii="Symbol" w:hAnsi="Symbol" w:hint="default"/>
+      </w:rPr>
+    </w:lvl>
+    <w:lvl w:ilvl="7" w:tplc="04090003" w:tentative="1">
+      <w:start w:val="1"/>
+      <w:numFmt w:val="bullet"/>
+      <w:lvlText w:val="o"/>
+      <w:lvlJc w:val="left"/>
+      <w:pPr>
+        <w:ind w:left="5760" w:hanging="360"/>
+      </w:pPr>
+      <w:rPr>
+        <w:rFonts w:ascii="Courier New" w:hAnsi="Courier New" w:cs="Courier New" w:hint="default"/>
+      </w:rPr>
+    </w:lvl>
+    <w:lvl w:ilvl="8" w:tplc="04090005" w:tentative="1">
+      <w:start w:val="1"/>
+      <w:numFmt w:val="bullet"/>
+      <w:lvlText w:val=""/>
+      <w:lvlJc w:val="left"/>
+      <w:pPr>
+        <w:ind w:left="6480" w:hanging="360"/>
+      </w:pPr>
+      <w:rPr>
+        <w:rFonts w:ascii="Wingdings" w:hAnsi="Wingdings" w:hint="default"/>
+      </w:rPr>
+    </w:lvl>
+  </w:abstractNum>
+  <w:abstractNum w:abstractNumId="1" w15:restartNumberingAfterBreak="0">
+    <w:nsid w:val="550038E3"/>
+    <w:multiLevelType w:val="hybridMultilevel"/>
+    <w:tmpl w:val="9208C154"/>
+    <w:lvl w:ilvl="0" w:tplc="D05628B8">
+      <w:numFmt w:val="bullet"/>
+      <w:lvlText w:val=""/>
+      <w:lvlJc w:val="left"/>
+      <w:pPr>
+        <w:ind w:left="720" w:hanging="360"/>
+      </w:pPr>
+      <w:rPr>
+        <w:rFonts w:ascii="Symbol" w:eastAsiaTheme="minorHAnsi" w:hAnsi="Symbol" w:cstheme="minorBidi" w:hint="default"/>
+      </w:rPr>
+    </w:lvl>
+    <w:lvl w:ilvl="1" w:tplc="04090003" w:tentative="1">
+      <w:start w:val="1"/>
+      <w:numFmt w:val="bullet"/>
+      <w:lvlText w:val="o"/>
+      <w:lvlJc w:val="left"/>
+      <w:pPr>
+        <w:ind w:left="1440" w:hanging="360"/>
+      </w:pPr>
+      <w:rPr>
+        <w:rFonts w:ascii="Courier New" w:hAnsi="Courier New" w:cs="Courier New" w:hint="default"/>
+      </w:rPr>
+    </w:lvl>
+    <w:lvl w:ilvl="2" w:tplc="04090005" w:tentative="1">
+      <w:start w:val="1"/>
+      <w:numFmt w:val="bullet"/>
+      <w:lvlText w:val=""/>
+      <w:lvlJc w:val="left"/>
+      <w:pPr>
+        <w:ind w:left="2160" w:hanging="360"/>
+      </w:pPr>
+      <w:rPr>
+        <w:rFonts w:ascii="Wingdings" w:hAnsi="Wingdings" w:hint="default"/>
+      </w:rPr>
+    </w:lvl>
+    <w:lvl w:ilvl="3" w:tplc="04090001" w:tentative="1">
+      <w:start w:val="1"/>
+      <w:numFmt w:val="bullet"/>
+      <w:lvlText w:val=""/>
+      <w:lvlJc w:val="left"/>
+      <w:pPr>
+        <w:ind w:left="2880" w:hanging="360"/>
+      </w:pPr>
+      <w:rPr>
+        <w:rFonts w:ascii="Symbol" w:hAnsi="Symbol" w:hint="default"/>
+      </w:rPr>
+    </w:lvl>
+    <w:lvl w:ilvl="4" w:tplc="04090003" w:tentative="1">
+      <w:start w:val="1"/>
+      <w:numFmt w:val="bullet"/>
+      <w:lvlText w:val="o"/>
+      <w:lvlJc w:val="left"/>
+      <w:pPr>
+        <w:ind w:left="3600" w:hanging="360"/>
+      </w:pPr>
+      <w:rPr>
+        <w:rFonts w:ascii="Courier New" w:hAnsi="Courier New" w:cs="Courier New" w:hint="default"/>
+      </w:rPr>
+    </w:lvl>
+    <w:lvl w:ilvl="5" w:tplc="04090005" w:tentative="1">
+      <w:start w:val="1"/>
+      <w:numFmt w:val="bullet"/>
+      <w:lvlText w:val=""/>
+      <w:lvlJc w:val="left"/>
+      <w:pPr>
+        <w:ind w:left="4320" w:hanging="360"/>
+      </w:pPr>
+      <w:rPr>
+        <w:rFonts w:ascii="Wingdings" w:hAnsi="Wingdings" w:hint="default"/>
+      </w:rPr>
+    </w:lvl>
+    <w:lvl w:ilvl="6" w:tplc="04090001" w:tentative="1">
+      <w:start w:val="1"/>
+      <w:numFmt w:val="bullet"/>
+      <w:lvlText w:val=""/>
+      <w:lvlJc w:val="left"/>
+      <w:pPr>
+        <w:ind w:left="5040" w:hanging="360"/>
+      </w:pPr>
+      <w:rPr>
+        <w:rFonts w:ascii="Symbol" w:hAnsi="Symbol" w:hint="default"/>
+      </w:rPr>
+    </w:lvl>
+    <w:lvl w:ilvl="7" w:tplc="04090003" w:tentative="1">
+      <w:start w:val="1"/>
+      <w:numFmt w:val="bullet"/>
+      <w:lvlText w:val="o"/>
+      <w:lvlJc w:val="left"/>
+      <w:pPr>
+        <w:ind w:left="5760" w:hanging="360"/>
+      </w:pPr>
+      <w:rPr>
+        <w:rFonts w:ascii="Courier New" w:hAnsi="Courier New" w:cs="Courier New" w:hint="default"/>
+      </w:rPr>
+    </w:lvl>
+    <w:lvl w:ilvl="8" w:tplc="04090005" w:tentative="1">
+      <w:start w:val="1"/>
+      <w:numFmt w:val="bullet"/>
+      <w:lvlText w:val=""/>
+      <w:lvlJc w:val="left"/>
+      <w:pPr>
+        <w:ind w:left="6480" w:hanging="360"/>
+      </w:pPr>
+      <w:rPr>
+        <w:rFonts w:ascii="Wingdings" w:hAnsi="Wingdings" w:hint="default"/>
+      </w:rPr>
+    </w:lvl>
+  </w:abstractNum>
+  <w:num w:numId="1" w16cid:durableId="231501440">
+    <w:abstractNumId w:val="1"/>
+  </w:num>
+  <w:num w:numId="2" w16cid:durableId="1685282470">
+    <w:abstractNumId w:val="0"/>
+  </w:num>
+</w:numbering>
 </file>
 
 <file path=word/styles.xml><?xml version="1.0" encoding="utf-8"?>
@@ -845,7 +1618,6 @@
   <w:style w:type="character" w:default="1" w:styleId="a0">
     <w:name w:val="Default Paragraph Font"/>
     <w:uiPriority w:val="1"/>
-    <w:semiHidden/>
     <w:unhideWhenUsed/>
   </w:style>
   <w:style w:type="table" w:default="1" w:styleId="a1">

</xml_diff>

<commit_message>
Cotninue the Retro THM CTF documentation
</commit_message>
<xml_diff>
--- a/THM_challenges/Hard/Retro/Retro_Solution_Documentation.docx
+++ b/THM_challenges/Hard/Retro/Retro_Solution_Documentation.docx
@@ -270,6 +270,9 @@
     </w:p>
     <w:p>
       <w:r>
+        <w:rPr>
+          <w:noProof/>
+        </w:rPr>
         <w:drawing>
           <wp:inline distT="0" distB="0" distL="0" distR="0" wp14:anchorId="0004448B" wp14:editId="3EC6433E">
             <wp:extent cx="5970787" cy="1638442"/>
@@ -381,6 +384,9 @@
     </w:p>
     <w:p>
       <w:r>
+        <w:rPr>
+          <w:noProof/>
+        </w:rPr>
         <w:lastRenderedPageBreak/>
         <w:drawing>
           <wp:inline distT="0" distB="0" distL="0" distR="0" wp14:anchorId="5722A853" wp14:editId="088D9E2F">
@@ -429,6 +435,9 @@
     </w:p>
     <w:p>
       <w:r>
+        <w:rPr>
+          <w:noProof/>
+        </w:rPr>
         <w:drawing>
           <wp:inline distT="0" distB="0" distL="0" distR="0" wp14:anchorId="0B5D8321" wp14:editId="537B0D1A">
             <wp:extent cx="4103726" cy="1531753"/>
@@ -532,6 +541,9 @@
     </w:p>
     <w:p>
       <w:r>
+        <w:rPr>
+          <w:noProof/>
+        </w:rPr>
         <w:lastRenderedPageBreak/>
         <w:drawing>
           <wp:inline distT="0" distB="0" distL="0" distR="0" wp14:anchorId="37F107AB" wp14:editId="33F84CE4">
@@ -603,6 +615,9 @@
     </w:p>
     <w:p>
       <w:r>
+        <w:rPr>
+          <w:noProof/>
+        </w:rPr>
         <w:drawing>
           <wp:inline distT="0" distB="0" distL="0" distR="0" wp14:anchorId="073EF632" wp14:editId="0F42FA06">
             <wp:extent cx="7556500" cy="3168015"/>
@@ -659,21 +674,79 @@
     </w:p>
     <w:p>
       <w:r>
+        <w:t xml:space="preserve">After a short inspection over the </w:t>
+      </w:r>
+      <w:r>
+        <w:t xml:space="preserve">dashboard, I didn’t </w:t>
+      </w:r>
+      <w:r>
+        <w:t>find</w:t>
+      </w:r>
+      <w:r>
+        <w:t xml:space="preserve"> any</w:t>
+      </w:r>
+      <w:r>
+        <w:t xml:space="preserve">thing useful </w:t>
+      </w:r>
+      <w:r>
+        <w:t xml:space="preserve">to continue the CTF. </w:t>
+      </w:r>
+      <w:r>
+        <w:t xml:space="preserve">Due to this reason, I </w:t>
+      </w:r>
+      <w:r>
+        <w:t xml:space="preserve">moved to </w:t>
+      </w:r>
+      <w:r>
+        <w:t xml:space="preserve">try and connect with the </w:t>
+      </w:r>
+      <w:r>
+        <w:t>credentials</w:t>
+      </w:r>
+      <w:r>
+        <w:t xml:space="preserve"> to the RDP</w:t>
+      </w:r>
+      <w:r>
+        <w:t xml:space="preserve"> service</w:t>
+      </w:r>
+      <w:r>
+        <w:t xml:space="preserve"> on the open port 3389 </w:t>
+      </w:r>
+      <w:r>
+        <w:t xml:space="preserve">that </w:t>
+      </w:r>
+      <w:r>
+        <w:t xml:space="preserve">I already discovered in the </w:t>
+      </w:r>
+      <w:r>
+        <w:t>Nmap scan</w:t>
+      </w:r>
+      <w:r>
+        <w:t xml:space="preserve">. </w:t>
+      </w:r>
+      <w:r>
+        <w:t>For this task, I used a tool named “</w:t>
+      </w:r>
+      <w:proofErr w:type="spellStart"/>
+      <w:r>
+        <w:t>Remmina</w:t>
+      </w:r>
+      <w:proofErr w:type="spellEnd"/>
+      <w:r>
+        <w:t>”</w:t>
+      </w:r>
+      <w:r>
+        <w:t>:</w:t>
+      </w:r>
+    </w:p>
+    <w:p>
+      <w:r>
         <w:lastRenderedPageBreak/>
-        <w:t>Second, I</w:t>
-      </w:r>
-      <w:r>
-        <w:t xml:space="preserve"> found on the “Comments” section the email of </w:t>
-      </w:r>
-      <w:r>
-        <w:t xml:space="preserve">Wade: </w:t>
-      </w:r>
-      <w:r>
         <w:drawing>
-          <wp:inline distT="0" distB="0" distL="0" distR="0" wp14:anchorId="6042327B" wp14:editId="768FE5B3">
-            <wp:extent cx="7556500" cy="2876550"/>
-            <wp:effectExtent l="0" t="0" r="6350" b="0"/>
-            <wp:docPr id="163927768" name="תמונה 1"/>
+          <wp:inline distT="0" distB="0" distL="0" distR="0" wp14:anchorId="500C8D58" wp14:editId="0C974B94">
+            <wp:extent cx="6275614" cy="3067316"/>
+            <wp:effectExtent l="0" t="0" r="0" b="0"/>
+            <wp:docPr id="1470952010" name="תמונה 1"/>
             <wp:cNvGraphicFramePr>
               <a:graphicFrameLocks xmlns:a="http://schemas.openxmlformats.org/drawingml/2006/main" noChangeAspect="1"/>
             </wp:cNvGraphicFramePr>
@@ -681,7 +754,7 @@
               <a:graphicData uri="http://schemas.openxmlformats.org/drawingml/2006/picture">
                 <pic:pic xmlns:pic="http://schemas.openxmlformats.org/drawingml/2006/picture">
                   <pic:nvPicPr>
-                    <pic:cNvPr id="163927768" name=""/>
+                    <pic:cNvPr id="1470952010" name=""/>
                     <pic:cNvPicPr/>
                   </pic:nvPicPr>
                   <pic:blipFill>
@@ -693,7 +766,7 @@
                   <pic:spPr>
                     <a:xfrm>
                       <a:off x="0" y="0"/>
-                      <a:ext cx="7556500" cy="2876550"/>
+                      <a:ext cx="6275614" cy="3067316"/>
                     </a:xfrm>
                     <a:prstGeom prst="rect">
                       <a:avLst/>
@@ -708,34 +781,22 @@
     </w:p>
     <w:p>
       <w:r>
-        <w:t xml:space="preserve">And third, I </w:t>
-      </w:r>
-      <w:r>
-        <w:t>noticed that this WordPress version is 5.2</w:t>
-      </w:r>
-      <w:r>
-        <w:t>.1 and that it has these plugins</w:t>
-      </w:r>
-      <w:r>
-        <w:t xml:space="preserve"> (so maybe one of them is </w:t>
-      </w:r>
-      <w:r>
-        <w:t>vulnerable</w:t>
-      </w:r>
-      <w:r>
-        <w:t>)</w:t>
-      </w:r>
-      <w:r>
-        <w:t>:</w:t>
+        <w:t>Here, I entered the target’s IP and it</w:t>
+      </w:r>
+      <w:r>
+        <w:t>s</w:t>
+      </w:r>
+      <w:r>
+        <w:t xml:space="preserve"> credentials:</w:t>
       </w:r>
     </w:p>
     <w:p>
       <w:r>
         <w:drawing>
-          <wp:inline distT="0" distB="0" distL="0" distR="0" wp14:anchorId="56E4AF9D" wp14:editId="4109DDD3">
-            <wp:extent cx="7556500" cy="1306195"/>
-            <wp:effectExtent l="0" t="0" r="6350" b="8255"/>
-            <wp:docPr id="1180399346" name="תמונה 1"/>
+          <wp:inline distT="0" distB="0" distL="0" distR="0" wp14:anchorId="2A85BBB0" wp14:editId="677E2541">
+            <wp:extent cx="5608806" cy="3570279"/>
+            <wp:effectExtent l="0" t="0" r="0" b="0"/>
+            <wp:docPr id="1495626152" name="תמונה 1"/>
             <wp:cNvGraphicFramePr>
               <a:graphicFrameLocks xmlns:a="http://schemas.openxmlformats.org/drawingml/2006/main" noChangeAspect="1"/>
             </wp:cNvGraphicFramePr>
@@ -743,7 +804,7 @@
               <a:graphicData uri="http://schemas.openxmlformats.org/drawingml/2006/picture">
                 <pic:pic xmlns:pic="http://schemas.openxmlformats.org/drawingml/2006/picture">
                   <pic:nvPicPr>
-                    <pic:cNvPr id="1180399346" name=""/>
+                    <pic:cNvPr id="1495626152" name=""/>
                     <pic:cNvPicPr/>
                   </pic:nvPicPr>
                   <pic:blipFill>
@@ -755,7 +816,7 @@
                   <pic:spPr>
                     <a:xfrm>
                       <a:off x="0" y="0"/>
-                      <a:ext cx="7556500" cy="1306195"/>
+                      <a:ext cx="5608806" cy="3570279"/>
                     </a:xfrm>
                     <a:prstGeom prst="rect">
                       <a:avLst/>
@@ -768,7 +829,216 @@
         </w:drawing>
       </w:r>
     </w:p>
-    <w:p/>
+    <w:p>
+      <w:r>
+        <w:t>And I clicked the OK button.</w:t>
+      </w:r>
+      <w:r>
+        <w:t xml:space="preserve"> After </w:t>
+      </w:r>
+      <w:r>
+        <w:t>that, I got connected to the machine:</w:t>
+      </w:r>
+    </w:p>
+    <w:p>
+      <w:r>
+        <w:lastRenderedPageBreak/>
+        <w:drawing>
+          <wp:inline distT="0" distB="0" distL="0" distR="0" wp14:anchorId="08892C40" wp14:editId="11733AD1">
+            <wp:extent cx="4343776" cy="3398815"/>
+            <wp:effectExtent l="0" t="0" r="0" b="0"/>
+            <wp:docPr id="625586287" name="תמונה 1"/>
+            <wp:cNvGraphicFramePr>
+              <a:graphicFrameLocks xmlns:a="http://schemas.openxmlformats.org/drawingml/2006/main" noChangeAspect="1"/>
+            </wp:cNvGraphicFramePr>
+            <a:graphic xmlns:a="http://schemas.openxmlformats.org/drawingml/2006/main">
+              <a:graphicData uri="http://schemas.openxmlformats.org/drawingml/2006/picture">
+                <pic:pic xmlns:pic="http://schemas.openxmlformats.org/drawingml/2006/picture">
+                  <pic:nvPicPr>
+                    <pic:cNvPr id="625586287" name=""/>
+                    <pic:cNvPicPr/>
+                  </pic:nvPicPr>
+                  <pic:blipFill>
+                    <a:blip r:embed="rId14"/>
+                    <a:stretch>
+                      <a:fillRect/>
+                    </a:stretch>
+                  </pic:blipFill>
+                  <pic:spPr>
+                    <a:xfrm>
+                      <a:off x="0" y="0"/>
+                      <a:ext cx="4343776" cy="3398815"/>
+                    </a:xfrm>
+                    <a:prstGeom prst="rect">
+                      <a:avLst/>
+                    </a:prstGeom>
+                  </pic:spPr>
+                </pic:pic>
+              </a:graphicData>
+            </a:graphic>
+          </wp:inline>
+        </w:drawing>
+      </w:r>
+    </w:p>
+    <w:p>
+      <w:r>
+        <w:t>Here, I saw the “user.txt” file in the Desktop.</w:t>
+      </w:r>
+      <w:r>
+        <w:t xml:space="preserve"> I opened it and found the user flag:</w:t>
+      </w:r>
+    </w:p>
+    <w:p>
+      <w:r>
+        <w:drawing>
+          <wp:inline distT="0" distB="0" distL="0" distR="0" wp14:anchorId="723FF0F6" wp14:editId="1A0BFCCA">
+            <wp:extent cx="1931837" cy="838273"/>
+            <wp:effectExtent l="0" t="0" r="0" b="0"/>
+            <wp:docPr id="1208247857" name="תמונה 1"/>
+            <wp:cNvGraphicFramePr>
+              <a:graphicFrameLocks xmlns:a="http://schemas.openxmlformats.org/drawingml/2006/main" noChangeAspect="1"/>
+            </wp:cNvGraphicFramePr>
+            <a:graphic xmlns:a="http://schemas.openxmlformats.org/drawingml/2006/main">
+              <a:graphicData uri="http://schemas.openxmlformats.org/drawingml/2006/picture">
+                <pic:pic xmlns:pic="http://schemas.openxmlformats.org/drawingml/2006/picture">
+                  <pic:nvPicPr>
+                    <pic:cNvPr id="1208247857" name=""/>
+                    <pic:cNvPicPr/>
+                  </pic:nvPicPr>
+                  <pic:blipFill>
+                    <a:blip r:embed="rId15"/>
+                    <a:stretch>
+                      <a:fillRect/>
+                    </a:stretch>
+                  </pic:blipFill>
+                  <pic:spPr>
+                    <a:xfrm>
+                      <a:off x="0" y="0"/>
+                      <a:ext cx="1931837" cy="838273"/>
+                    </a:xfrm>
+                    <a:prstGeom prst="rect">
+                      <a:avLst/>
+                    </a:prstGeom>
+                  </pic:spPr>
+                </pic:pic>
+              </a:graphicData>
+            </a:graphic>
+          </wp:inline>
+        </w:drawing>
+      </w:r>
+    </w:p>
+    <w:p>
+      <w:r>
+        <w:t>After that, I moved to find the root flag.</w:t>
+      </w:r>
+    </w:p>
+    <w:p>
+      <w:r>
+        <w:t xml:space="preserve">I read the hint </w:t>
+      </w:r>
+      <w:r>
+        <w:rPr>
+          <w:b/>
+          <w:bCs/>
+          <w:i/>
+          <w:iCs/>
+        </w:rPr>
+        <w:t>“</w:t>
+      </w:r>
+      <w:r>
+        <w:rPr>
+          <w:b/>
+          <w:bCs/>
+          <w:i/>
+          <w:iCs/>
+        </w:rPr>
+        <w:t>Figure out what the user last was trying to find</w:t>
+      </w:r>
+      <w:proofErr w:type="gramStart"/>
+      <w:r>
+        <w:rPr>
+          <w:b/>
+          <w:bCs/>
+          <w:i/>
+          <w:iCs/>
+        </w:rPr>
+        <w:t>.</w:t>
+      </w:r>
+      <w:proofErr w:type="gramEnd"/>
+      <w:r>
+        <w:rPr>
+          <w:b/>
+          <w:bCs/>
+          <w:i/>
+          <w:iCs/>
+        </w:rPr>
+        <w:t xml:space="preserve"> Otherwise, put this one on ice and get yourself a better shell, perhaps one dipped in venom</w:t>
+      </w:r>
+      <w:r>
+        <w:rPr>
+          <w:b/>
+          <w:bCs/>
+          <w:i/>
+          <w:iCs/>
+        </w:rPr>
+        <w:t>”</w:t>
+      </w:r>
+      <w:r>
+        <w:t>.</w:t>
+      </w:r>
+    </w:p>
+    <w:p>
+      <w:r>
+        <w:t>I started by opening the Recycle Bin because I notice that it was not empty:</w:t>
+      </w:r>
+    </w:p>
+    <w:p>
+      <w:r>
+        <w:drawing>
+          <wp:inline distT="0" distB="0" distL="0" distR="0" wp14:anchorId="0459B243" wp14:editId="574A5D70">
+            <wp:extent cx="4305673" cy="2933954"/>
+            <wp:effectExtent l="0" t="0" r="0" b="0"/>
+            <wp:docPr id="1275021408" name="תמונה 1" descr="תמונה שמכילה טקסט, צילום מסך, תוכנה, סמל מחשב&#10;&#10;תוכן בינה מלאכותית גנרטיבית עשוי להיות שגוי."/>
+            <wp:cNvGraphicFramePr>
+              <a:graphicFrameLocks xmlns:a="http://schemas.openxmlformats.org/drawingml/2006/main" noChangeAspect="1"/>
+            </wp:cNvGraphicFramePr>
+            <a:graphic xmlns:a="http://schemas.openxmlformats.org/drawingml/2006/main">
+              <a:graphicData uri="http://schemas.openxmlformats.org/drawingml/2006/picture">
+                <pic:pic xmlns:pic="http://schemas.openxmlformats.org/drawingml/2006/picture">
+                  <pic:nvPicPr>
+                    <pic:cNvPr id="1275021408" name="תמונה 1" descr="תמונה שמכילה טקסט, צילום מסך, תוכנה, סמל מחשב&#10;&#10;תוכן בינה מלאכותית גנרטיבית עשוי להיות שגוי."/>
+                    <pic:cNvPicPr/>
+                  </pic:nvPicPr>
+                  <pic:blipFill>
+                    <a:blip r:embed="rId16"/>
+                    <a:stretch>
+                      <a:fillRect/>
+                    </a:stretch>
+                  </pic:blipFill>
+                  <pic:spPr>
+                    <a:xfrm>
+                      <a:off x="0" y="0"/>
+                      <a:ext cx="4305673" cy="2933954"/>
+                    </a:xfrm>
+                    <a:prstGeom prst="rect">
+                      <a:avLst/>
+                    </a:prstGeom>
+                  </pic:spPr>
+                </pic:pic>
+              </a:graphicData>
+            </a:graphic>
+          </wp:inline>
+        </w:drawing>
+      </w:r>
+    </w:p>
+    <w:p>
+      <w:r>
+        <w:t xml:space="preserve">I saw here this </w:t>
+      </w:r>
+      <w:r>
+        <w:t>program.</w:t>
+      </w:r>
+    </w:p>
     <w:sectPr>
       <w:pgSz w:w="12240" w:h="15840"/>
       <w:pgMar w:top="170" w:right="170" w:bottom="170" w:left="170" w:header="720" w:footer="720" w:gutter="0"/>

</xml_diff>

<commit_message>
The Retro THM CTF was completed!!!!!
</commit_message>
<xml_diff>
--- a/THM_challenges/Hard/Retro/Retro_Solution_Documentation.docx
+++ b/THM_challenges/Hard/Retro/Retro_Solution_Documentation.docx
@@ -741,6 +741,9 @@
     </w:p>
     <w:p>
       <w:r>
+        <w:rPr>
+          <w:noProof/>
+        </w:rPr>
         <w:lastRenderedPageBreak/>
         <w:drawing>
           <wp:inline distT="0" distB="0" distL="0" distR="0" wp14:anchorId="500C8D58" wp14:editId="0C974B94">
@@ -792,6 +795,9 @@
     </w:p>
     <w:p>
       <w:r>
+        <w:rPr>
+          <w:noProof/>
+        </w:rPr>
         <w:drawing>
           <wp:inline distT="0" distB="0" distL="0" distR="0" wp14:anchorId="2A85BBB0" wp14:editId="677E2541">
             <wp:extent cx="5608806" cy="3570279"/>
@@ -842,6 +848,9 @@
     </w:p>
     <w:p>
       <w:r>
+        <w:rPr>
+          <w:noProof/>
+        </w:rPr>
         <w:lastRenderedPageBreak/>
         <w:drawing>
           <wp:inline distT="0" distB="0" distL="0" distR="0" wp14:anchorId="08892C40" wp14:editId="11733AD1">
@@ -890,6 +899,9 @@
     </w:p>
     <w:p>
       <w:r>
+        <w:rPr>
+          <w:noProof/>
+        </w:rPr>
         <w:drawing>
           <wp:inline distT="0" distB="0" distL="0" distR="0" wp14:anchorId="723FF0F6" wp14:editId="1A0BFCCA">
             <wp:extent cx="1931837" cy="838273"/>
@@ -934,71 +946,31 @@
     </w:p>
     <w:p>
       <w:r>
-        <w:t xml:space="preserve">I read the hint </w:t>
-      </w:r>
-      <w:r>
-        <w:rPr>
-          <w:b/>
-          <w:bCs/>
-          <w:i/>
-          <w:iCs/>
-        </w:rPr>
-        <w:t>“</w:t>
-      </w:r>
-      <w:r>
-        <w:rPr>
-          <w:b/>
-          <w:bCs/>
-          <w:i/>
-          <w:iCs/>
-        </w:rPr>
-        <w:t>Figure out what the user last was trying to find</w:t>
-      </w:r>
-      <w:proofErr w:type="gramStart"/>
-      <w:r>
-        <w:rPr>
-          <w:b/>
-          <w:bCs/>
-          <w:i/>
-          <w:iCs/>
-        </w:rPr>
-        <w:t>.</w:t>
-      </w:r>
-      <w:proofErr w:type="gramEnd"/>
-      <w:r>
-        <w:rPr>
-          <w:b/>
-          <w:bCs/>
-          <w:i/>
-          <w:iCs/>
-        </w:rPr>
-        <w:t xml:space="preserve"> Otherwise, put this one on ice and get yourself a better shell, perhaps one dipped in venom</w:t>
-      </w:r>
-      <w:r>
-        <w:rPr>
-          <w:b/>
-          <w:bCs/>
-          <w:i/>
-          <w:iCs/>
-        </w:rPr>
-        <w:t>”</w:t>
-      </w:r>
-      <w:r>
-        <w:t>.</w:t>
-      </w:r>
-    </w:p>
-    <w:p>
-      <w:r>
-        <w:t>I started by opening the Recycle Bin because I notice that it was not empty:</w:t>
-      </w:r>
-    </w:p>
-    <w:p>
-      <w:r>
+        <w:t xml:space="preserve">I started </w:t>
+      </w:r>
+      <w:r>
+        <w:t>by getting information about this specific windows machine system using the “</w:t>
+      </w:r>
+      <w:proofErr w:type="spellStart"/>
+      <w:r>
+        <w:t>systeminfo</w:t>
+      </w:r>
+      <w:proofErr w:type="spellEnd"/>
+      <w:r>
+        <w:t>” CMD command</w:t>
+      </w:r>
+      <w:r>
+        <w:t>:</w:t>
+      </w:r>
+    </w:p>
+    <w:p>
+      <w:r>
+        <w:lastRenderedPageBreak/>
         <w:drawing>
-          <wp:inline distT="0" distB="0" distL="0" distR="0" wp14:anchorId="0459B243" wp14:editId="574A5D70">
-            <wp:extent cx="4305673" cy="2933954"/>
+          <wp:inline distT="0" distB="0" distL="0" distR="0" wp14:anchorId="69F03F6A" wp14:editId="40BDA664">
+            <wp:extent cx="6809060" cy="5372566"/>
             <wp:effectExtent l="0" t="0" r="0" b="0"/>
-            <wp:docPr id="1275021408" name="תמונה 1" descr="תמונה שמכילה טקסט, צילום מסך, תוכנה, סמל מחשב&#10;&#10;תוכן בינה מלאכותית גנרטיבית עשוי להיות שגוי."/>
+            <wp:docPr id="205840408" name="תמונה 1"/>
             <wp:cNvGraphicFramePr>
               <a:graphicFrameLocks xmlns:a="http://schemas.openxmlformats.org/drawingml/2006/main" noChangeAspect="1"/>
             </wp:cNvGraphicFramePr>
@@ -1006,7 +978,7 @@
               <a:graphicData uri="http://schemas.openxmlformats.org/drawingml/2006/picture">
                 <pic:pic xmlns:pic="http://schemas.openxmlformats.org/drawingml/2006/picture">
                   <pic:nvPicPr>
-                    <pic:cNvPr id="1275021408" name="תמונה 1" descr="תמונה שמכילה טקסט, צילום מסך, תוכנה, סמל מחשב&#10;&#10;תוכן בינה מלאכותית גנרטיבית עשוי להיות שגוי."/>
+                    <pic:cNvPr id="205840408" name=""/>
                     <pic:cNvPicPr/>
                   </pic:nvPicPr>
                   <pic:blipFill>
@@ -1018,7 +990,7 @@
                   <pic:spPr>
                     <a:xfrm>
                       <a:off x="0" y="0"/>
-                      <a:ext cx="4305673" cy="2933954"/>
+                      <a:ext cx="6809060" cy="5372566"/>
                     </a:xfrm>
                     <a:prstGeom prst="rect">
                       <a:avLst/>
@@ -1033,10 +1005,324 @@
     </w:p>
     <w:p>
       <w:r>
-        <w:t xml:space="preserve">I saw here this </w:t>
-      </w:r>
-      <w:r>
-        <w:t>program.</w:t>
+        <w:t xml:space="preserve">I found that this machine is “Windows Server 2016 </w:t>
+      </w:r>
+      <w:proofErr w:type="spellStart"/>
+      <w:r>
+        <w:t>strandard</w:t>
+      </w:r>
+      <w:proofErr w:type="spellEnd"/>
+      <w:r>
+        <w:t>”.</w:t>
+      </w:r>
+      <w:r>
+        <w:t xml:space="preserve"> I searched a little on the internet and found that GitHub repository which contains </w:t>
+      </w:r>
+      <w:r>
+        <w:t xml:space="preserve">large amounts of exploits </w:t>
+      </w:r>
+      <w:r>
+        <w:t xml:space="preserve">for windows </w:t>
+      </w:r>
+      <w:r>
+        <w:t>kernel</w:t>
+      </w:r>
+      <w:r>
+        <w:t>s:</w:t>
+      </w:r>
+      <w:r>
+        <w:t xml:space="preserve"> </w:t>
+      </w:r>
+      <w:hyperlink r:id="rId17" w:history="1">
+        <w:r>
+          <w:rPr>
+            <w:rStyle w:val="Hyperlink"/>
+          </w:rPr>
+          <w:t>https://github.com/SecWiki/windows-kernel-exploits/tree/master/CVE-2017-0213</w:t>
+        </w:r>
+      </w:hyperlink>
+      <w:r>
+        <w:t>.</w:t>
+      </w:r>
+    </w:p>
+    <w:p>
+      <w:r>
+        <w:t xml:space="preserve">I downloaded this </w:t>
+      </w:r>
+      <w:r>
+        <w:t>to my machine</w:t>
+      </w:r>
+      <w:r>
+        <w:t>, unzipped it</w:t>
+      </w:r>
+      <w:r>
+        <w:t xml:space="preserve"> </w:t>
+      </w:r>
+      <w:r>
+        <w:t>and transferred the “</w:t>
+      </w:r>
+      <w:r>
+        <w:t>CVE-2017-0213_x64.</w:t>
+      </w:r>
+      <w:r>
+        <w:t xml:space="preserve">exe” to the </w:t>
+      </w:r>
+      <w:r>
+        <w:t>target machine</w:t>
+      </w:r>
+      <w:r>
+        <w:t xml:space="preserve"> using python </w:t>
+      </w:r>
+      <w:r>
+        <w:t xml:space="preserve">http </w:t>
+      </w:r>
+      <w:r>
+        <w:t>server</w:t>
+      </w:r>
+      <w:r>
+        <w:t>:</w:t>
+      </w:r>
+    </w:p>
+    <w:p>
+      <w:r>
+        <w:drawing>
+          <wp:inline distT="0" distB="0" distL="0" distR="0" wp14:anchorId="2082368B" wp14:editId="3E73351C">
+            <wp:extent cx="2198561" cy="704911"/>
+            <wp:effectExtent l="0" t="0" r="0" b="0"/>
+            <wp:docPr id="1078801454" name="תמונה 1"/>
+            <wp:cNvGraphicFramePr>
+              <a:graphicFrameLocks xmlns:a="http://schemas.openxmlformats.org/drawingml/2006/main" noChangeAspect="1"/>
+            </wp:cNvGraphicFramePr>
+            <a:graphic xmlns:a="http://schemas.openxmlformats.org/drawingml/2006/main">
+              <a:graphicData uri="http://schemas.openxmlformats.org/drawingml/2006/picture">
+                <pic:pic xmlns:pic="http://schemas.openxmlformats.org/drawingml/2006/picture">
+                  <pic:nvPicPr>
+                    <pic:cNvPr id="1078801454" name=""/>
+                    <pic:cNvPicPr/>
+                  </pic:nvPicPr>
+                  <pic:blipFill>
+                    <a:blip r:embed="rId18"/>
+                    <a:stretch>
+                      <a:fillRect/>
+                    </a:stretch>
+                  </pic:blipFill>
+                  <pic:spPr>
+                    <a:xfrm>
+                      <a:off x="0" y="0"/>
+                      <a:ext cx="2198561" cy="704911"/>
+                    </a:xfrm>
+                    <a:prstGeom prst="rect">
+                      <a:avLst/>
+                    </a:prstGeom>
+                  </pic:spPr>
+                </pic:pic>
+              </a:graphicData>
+            </a:graphic>
+          </wp:inline>
+        </w:drawing>
+      </w:r>
+    </w:p>
+    <w:p>
+      <w:r>
+        <w:drawing>
+          <wp:inline distT="0" distB="0" distL="0" distR="0" wp14:anchorId="41D83EF6" wp14:editId="1FF44D3F">
+            <wp:extent cx="5132515" cy="1200254"/>
+            <wp:effectExtent l="0" t="0" r="0" b="0"/>
+            <wp:docPr id="1884717918" name="תמונה 1"/>
+            <wp:cNvGraphicFramePr>
+              <a:graphicFrameLocks xmlns:a="http://schemas.openxmlformats.org/drawingml/2006/main" noChangeAspect="1"/>
+            </wp:cNvGraphicFramePr>
+            <a:graphic xmlns:a="http://schemas.openxmlformats.org/drawingml/2006/main">
+              <a:graphicData uri="http://schemas.openxmlformats.org/drawingml/2006/picture">
+                <pic:pic xmlns:pic="http://schemas.openxmlformats.org/drawingml/2006/picture">
+                  <pic:nvPicPr>
+                    <pic:cNvPr id="1884717918" name=""/>
+                    <pic:cNvPicPr/>
+                  </pic:nvPicPr>
+                  <pic:blipFill>
+                    <a:blip r:embed="rId19"/>
+                    <a:stretch>
+                      <a:fillRect/>
+                    </a:stretch>
+                  </pic:blipFill>
+                  <pic:spPr>
+                    <a:xfrm>
+                      <a:off x="0" y="0"/>
+                      <a:ext cx="5132515" cy="1200254"/>
+                    </a:xfrm>
+                    <a:prstGeom prst="rect">
+                      <a:avLst/>
+                    </a:prstGeom>
+                  </pic:spPr>
+                </pic:pic>
+              </a:graphicData>
+            </a:graphic>
+          </wp:inline>
+        </w:drawing>
+      </w:r>
+    </w:p>
+    <w:p>
+      <w:r>
+        <w:lastRenderedPageBreak/>
+        <w:drawing>
+          <wp:inline distT="0" distB="0" distL="0" distR="0" wp14:anchorId="735DA9E0" wp14:editId="6B4AD947">
+            <wp:extent cx="5505927" cy="5685013"/>
+            <wp:effectExtent l="0" t="0" r="0" b="0"/>
+            <wp:docPr id="1538462431" name="תמונה 1"/>
+            <wp:cNvGraphicFramePr>
+              <a:graphicFrameLocks xmlns:a="http://schemas.openxmlformats.org/drawingml/2006/main" noChangeAspect="1"/>
+            </wp:cNvGraphicFramePr>
+            <a:graphic xmlns:a="http://schemas.openxmlformats.org/drawingml/2006/main">
+              <a:graphicData uri="http://schemas.openxmlformats.org/drawingml/2006/picture">
+                <pic:pic xmlns:pic="http://schemas.openxmlformats.org/drawingml/2006/picture">
+                  <pic:nvPicPr>
+                    <pic:cNvPr id="1538462431" name=""/>
+                    <pic:cNvPicPr/>
+                  </pic:nvPicPr>
+                  <pic:blipFill>
+                    <a:blip r:embed="rId20"/>
+                    <a:stretch>
+                      <a:fillRect/>
+                    </a:stretch>
+                  </pic:blipFill>
+                  <pic:spPr>
+                    <a:xfrm>
+                      <a:off x="0" y="0"/>
+                      <a:ext cx="5505927" cy="5685013"/>
+                    </a:xfrm>
+                    <a:prstGeom prst="rect">
+                      <a:avLst/>
+                    </a:prstGeom>
+                  </pic:spPr>
+                </pic:pic>
+              </a:graphicData>
+            </a:graphic>
+          </wp:inline>
+        </w:drawing>
+      </w:r>
+    </w:p>
+    <w:p>
+      <w:r>
+        <w:t xml:space="preserve">And now I run this </w:t>
+      </w:r>
+      <w:r>
+        <w:t>exploit</w:t>
+      </w:r>
+      <w:r>
+        <w:t xml:space="preserve"> </w:t>
+      </w:r>
+      <w:r>
+        <w:t>via</w:t>
+      </w:r>
+      <w:r>
+        <w:t xml:space="preserve"> the </w:t>
+      </w:r>
+      <w:r>
+        <w:t>target machine:</w:t>
+      </w:r>
+    </w:p>
+    <w:p>
+      <w:r>
+        <w:drawing>
+          <wp:inline distT="0" distB="0" distL="0" distR="0" wp14:anchorId="1B9DDF93" wp14:editId="1296DDF3">
+            <wp:extent cx="4103726" cy="3303556"/>
+            <wp:effectExtent l="0" t="0" r="0" b="0"/>
+            <wp:docPr id="1000239466" name="תמונה 1"/>
+            <wp:cNvGraphicFramePr>
+              <a:graphicFrameLocks xmlns:a="http://schemas.openxmlformats.org/drawingml/2006/main" noChangeAspect="1"/>
+            </wp:cNvGraphicFramePr>
+            <a:graphic xmlns:a="http://schemas.openxmlformats.org/drawingml/2006/main">
+              <a:graphicData uri="http://schemas.openxmlformats.org/drawingml/2006/picture">
+                <pic:pic xmlns:pic="http://schemas.openxmlformats.org/drawingml/2006/picture">
+                  <pic:nvPicPr>
+                    <pic:cNvPr id="1000239466" name=""/>
+                    <pic:cNvPicPr/>
+                  </pic:nvPicPr>
+                  <pic:blipFill>
+                    <a:blip r:embed="rId21"/>
+                    <a:stretch>
+                      <a:fillRect/>
+                    </a:stretch>
+                  </pic:blipFill>
+                  <pic:spPr>
+                    <a:xfrm>
+                      <a:off x="0" y="0"/>
+                      <a:ext cx="4103726" cy="3303556"/>
+                    </a:xfrm>
+                    <a:prstGeom prst="rect">
+                      <a:avLst/>
+                    </a:prstGeom>
+                  </pic:spPr>
+                </pic:pic>
+              </a:graphicData>
+            </a:graphic>
+          </wp:inline>
+        </w:drawing>
+      </w:r>
+    </w:p>
+    <w:p>
+      <w:r>
+        <w:t xml:space="preserve">And it automatically opened a </w:t>
+      </w:r>
+      <w:r>
+        <w:t>CMD command promp</w:t>
+      </w:r>
+      <w:r>
+        <w:t xml:space="preserve">t </w:t>
+      </w:r>
+      <w:r>
+        <w:t>with admin permissions:</w:t>
+      </w:r>
+    </w:p>
+    <w:p>
+      <w:r>
+        <w:lastRenderedPageBreak/>
+        <w:drawing>
+          <wp:inline distT="0" distB="0" distL="0" distR="0" wp14:anchorId="01CB381A" wp14:editId="203163D1">
+            <wp:extent cx="4839119" cy="2465284"/>
+            <wp:effectExtent l="0" t="0" r="0" b="0"/>
+            <wp:docPr id="1104543539" name="תמונה 1" descr="תמונה שמכילה טקסט, צילום מסך, תוכנה, תכונות מולטימדיה&#10;&#10;תוכן בינה מלאכותית גנרטיבית עשוי להיות שגוי."/>
+            <wp:cNvGraphicFramePr>
+              <a:graphicFrameLocks xmlns:a="http://schemas.openxmlformats.org/drawingml/2006/main" noChangeAspect="1"/>
+            </wp:cNvGraphicFramePr>
+            <a:graphic xmlns:a="http://schemas.openxmlformats.org/drawingml/2006/main">
+              <a:graphicData uri="http://schemas.openxmlformats.org/drawingml/2006/picture">
+                <pic:pic xmlns:pic="http://schemas.openxmlformats.org/drawingml/2006/picture">
+                  <pic:nvPicPr>
+                    <pic:cNvPr id="1104543539" name="תמונה 1" descr="תמונה שמכילה טקסט, צילום מסך, תוכנה, תכונות מולטימדיה&#10;&#10;תוכן בינה מלאכותית גנרטיבית עשוי להיות שגוי."/>
+                    <pic:cNvPicPr/>
+                  </pic:nvPicPr>
+                  <pic:blipFill>
+                    <a:blip r:embed="rId22"/>
+                    <a:stretch>
+                      <a:fillRect/>
+                    </a:stretch>
+                  </pic:blipFill>
+                  <pic:spPr>
+                    <a:xfrm>
+                      <a:off x="0" y="0"/>
+                      <a:ext cx="4839119" cy="2465284"/>
+                    </a:xfrm>
+                    <a:prstGeom prst="rect">
+                      <a:avLst/>
+                    </a:prstGeom>
+                  </pic:spPr>
+                </pic:pic>
+              </a:graphicData>
+            </a:graphic>
+          </wp:inline>
+        </w:drawing>
+      </w:r>
+    </w:p>
+    <w:p>
+      <w:r>
+        <w:t>Here, I just navigated to the Administrator’s “/Desktop” directory and there I found the “root.txt” file</w:t>
+      </w:r>
+      <w:r>
+        <w:t xml:space="preserve"> and the root flag which it contains</w:t>
+      </w:r>
+      <w:r>
+        <w:t>.</w:t>
       </w:r>
     </w:p>
     <w:sectPr>
@@ -2201,6 +2487,29 @@
       <w:spacing w:val="5"/>
     </w:rPr>
   </w:style>
+  <w:style w:type="character" w:styleId="Hyperlink">
+    <w:name w:val="Hyperlink"/>
+    <w:basedOn w:val="a0"/>
+    <w:uiPriority w:val="99"/>
+    <w:unhideWhenUsed/>
+    <w:rsid w:val="00880CCD"/>
+    <w:rPr>
+      <w:color w:val="467886" w:themeColor="hyperlink"/>
+      <w:u w:val="single"/>
+    </w:rPr>
+  </w:style>
+  <w:style w:type="character" w:styleId="ae">
+    <w:name w:val="Unresolved Mention"/>
+    <w:basedOn w:val="a0"/>
+    <w:uiPriority w:val="99"/>
+    <w:semiHidden/>
+    <w:unhideWhenUsed/>
+    <w:rsid w:val="00880CCD"/>
+    <w:rPr>
+      <w:color w:val="605E5C"/>
+      <w:shd w:val="clear" w:color="auto" w:fill="E1DFDD"/>
+    </w:rPr>
+  </w:style>
 </w:styles>
 </file>
 

</xml_diff>